<commit_message>
Allow users to send signed NCNDA documents via email
Update the document sending logic to correctly validate signatures for NCNDA documents before allowing them to be sent.

Replit-Commit-Author: Agent
Replit-Commit-Session-Id: 359075c4-f6cc-4727-990b-acbaafad0c22
Replit-Commit-Checkpoint-Type: full_checkpoint
Replit-Commit-Event-Id: 71d572df-d6c0-4120-8709-8418e8cc6929
Replit-Commit-Screenshot-Url: https://storage.googleapis.com/screenshot-production-us-central1/efc895ca-161b-43cb-8555-2a7825ee93b6/359075c4-f6cc-4727-990b-acbaafad0c22/qMp1Md3
Replit-Helium-Checkpoint-Created: true
</commit_message>
<xml_diff>
--- a/generated_docs/54e6fd5b-ea83-47f6-9f0f-3267c17d16b2.docx
+++ b/generated_docs/54e6fd5b-ea83-47f6-9f0f-3267c17d16b2.docx
@@ -1513,6 +1513,68 @@
       <w:pPr>
         <w:spacing w:after="60" w:before="60"/>
       </w:pPr>
+    </w:p>
+    <w:p>
+      <w:pPr>
+        <w:spacing w:before="400"/>
+      </w:pPr>
+    </w:p>
+    <w:p>
+      <w:pPr>
+        <w:pBdr>
+          <w:bottom w:val="single" w:color="333333" w:sz="2"/>
+        </w:pBdr>
+        <w:spacing w:after="200"/>
+        <w:jc w:val="center"/>
+      </w:pPr>
+      <w:r>
+        <w:rPr>
+          <w:rFonts w:ascii="Calibri" w:cs="Calibri" w:eastAsia="Calibri" w:hAnsi="Calibri"/>
+          <w:b/>
+          <w:bCs/>
+          <w:sz w:val="22"/>
+          <w:szCs w:val="22"/>
+        </w:rPr>
+        <w:t xml:space="preserve">DIGITAL SIGNATURE</w:t>
+      </w:r>
+    </w:p>
+    <w:p>
+      <w:pPr>
+        <w:spacing w:after="100"/>
+      </w:pPr>
+      <w:r>
+        <w:rPr>
+          <w:rFonts w:ascii="Calibri" w:cs="Calibri" w:eastAsia="Calibri" w:hAnsi="Calibri"/>
+          <w:b/>
+          <w:bCs/>
+          <w:sz w:val="18"/>
+          <w:szCs w:val="18"/>
+        </w:rPr>
+        <w:t xml:space="preserve">FOR &amp; ON BEHALF OF BUYER / ISSUER</w:t>
+      </w:r>
+    </w:p>
+    <w:p>
+      <w:pPr>
+        <w:spacing w:after="40"/>
+      </w:pPr>
+      <w:r>
+        <w:rPr>
+          <w:rFonts w:ascii="Calibri" w:cs="Calibri" w:eastAsia="Calibri" w:hAnsi="Calibri"/>
+          <w:sz w:val="18"/>
+          <w:szCs w:val="18"/>
+        </w:rPr>
+        <w:t xml:space="preserve">Name: _______________</w:t>
+      </w:r>
+    </w:p>
+    <w:p>
+      <w:r>
+        <w:rPr>
+          <w:rFonts w:ascii="Calibri" w:cs="Calibri" w:eastAsia="Calibri" w:hAnsi="Calibri"/>
+          <w:sz w:val="18"/>
+          <w:szCs w:val="18"/>
+        </w:rPr>
+        <w:t xml:space="preserve">Date: _______________</w:t>
+      </w:r>
     </w:p>
     <w:p>
       <w:pPr>

</xml_diff>